<commit_message>
Propuestas GDA 5 secciones: 44 documentos ES/EN para 22 universidades
- Pregunta de investigacion focalizada (gobernanza -> VCO), antifragilidad removida
- Secciones 2-3-4 reescritas; linaje sociotecnico Trist 1951/1965/1981 + Abbas&Michael 2026
- Referencias APA consolidadas (25 nucleo; UPM +2)
- Encajes especificos por universidad (22)
- Generador reutilizable generar_propuestas.py
- Checkpoint ESTADO_ACTUAL.md para continuidad entre conversaciones
- Nuevas carpetas: 3 espanolas (UV, UAM, UPC) + 7 internacionales + 6 nordicas

Co-Authored-By: Claude Opus 4.8 <noreply@anthropic.com>
</commit_message>
<xml_diff>
--- a/06_Universidades/Aplicaciones_Activas/03_Loyola/Entrevista_Admision_Loyola_Diligenciada.docx
+++ b/06_Universidades/Aplicaciones_Activas/03_Loyola/Entrevista_Admision_Loyola_Diligenciada.docx
@@ -300,42 +300,6 @@
               </w:rPr>
               <w:t>Fecha entrevista: 08/06/2026</w:t>
             </w:r>
-            <w:r>
-              <w:rPr>
-                <w:rFonts w:ascii="Calibri Light" w:hAnsi="Calibri Light" w:cs="Calibri Light"/>
-                <w:b w:val="0"/>
-                <w:color w:val="auto"/>
-                <w:sz w:val="22"/>
-                <w:szCs w:val="22"/>
-              </w:rPr>
-            </w:r>
-            <w:r>
-              <w:rPr>
-                <w:rFonts w:ascii="Calibri Light" w:hAnsi="Calibri Light" w:cs="Calibri Light"/>
-                <w:b w:val="0"/>
-                <w:color w:val="auto"/>
-                <w:sz w:val="22"/>
-                <w:szCs w:val="22"/>
-              </w:rPr>
-            </w:r>
-            <w:r>
-              <w:rPr>
-                <w:rFonts w:ascii="Calibri Light" w:hAnsi="Calibri Light" w:cs="Calibri Light"/>
-                <w:b w:val="0"/>
-                <w:color w:val="auto"/>
-                <w:sz w:val="22"/>
-                <w:szCs w:val="22"/>
-              </w:rPr>
-            </w:r>
-            <w:r>
-              <w:rPr>
-                <w:rFonts w:ascii="Calibri Light" w:hAnsi="Calibri Light" w:cs="Calibri Light"/>
-                <w:b w:val="0"/>
-                <w:color w:val="auto"/>
-                <w:sz w:val="22"/>
-                <w:szCs w:val="22"/>
-              </w:rPr>
-            </w:r>
           </w:p>
         </w:tc>
         <w:tc>
@@ -421,39 +385,11 @@
             <w:r>
               <w:rPr>
                 <w:rFonts w:ascii="Calibri Light" w:hAnsi="Calibri Light" w:cs="Calibri Light"/>
-                <w:b/>
                 <w:color w:val="auto"/>
                 <w:sz w:val="22"/>
                 <w:szCs w:val="22"/>
               </w:rPr>
               <w:t>Candidato/a: Daniel Alejandro Pajoy Bastos</w:t>
-            </w:r>
-            <w:r>
-              <w:rPr>
-                <w:rFonts w:ascii="Calibri Light" w:hAnsi="Calibri Light" w:cs="Calibri Light"/>
-                <w:b w:val="0"/>
-                <w:color w:val="auto"/>
-                <w:sz w:val="22"/>
-                <w:szCs w:val="22"/>
-              </w:rPr>
-            </w:r>
-            <w:r>
-              <w:rPr>
-                <w:rFonts w:ascii="Calibri Light" w:hAnsi="Calibri Light" w:cs="Calibri Light"/>
-                <w:b w:val="0"/>
-                <w:color w:val="auto"/>
-                <w:sz w:val="22"/>
-                <w:szCs w:val="22"/>
-              </w:rPr>
-            </w:r>
-            <w:r>
-              <w:rPr>
-                <w:rFonts w:ascii="Calibri Light" w:hAnsi="Calibri Light" w:cs="Calibri Light"/>
-                <w:b w:val="0"/>
-                <w:color w:val="auto"/>
-                <w:sz w:val="22"/>
-                <w:szCs w:val="22"/>
-              </w:rPr>
             </w:r>
           </w:p>
         </w:tc>
@@ -491,15 +427,6 @@
                 <w:szCs w:val="22"/>
               </w:rPr>
               <w:t>Universidad: Universidad EAFIT (Medellín, Colombia) — MBA</w:t>
-            </w:r>
-            <w:r>
-              <w:rPr>
-                <w:rFonts w:ascii="Calibri Light" w:hAnsi="Calibri Light" w:cs="Calibri Light"/>
-                <w:b w:val="0"/>
-                <w:color w:val="auto"/>
-                <w:sz w:val="22"/>
-                <w:szCs w:val="22"/>
-              </w:rPr>
             </w:r>
           </w:p>
         </w:tc>
@@ -541,15 +468,6 @@
               </w:rPr>
               <w:t>Edad: 43 años (11/11/1982)</w:t>
             </w:r>
-            <w:r>
-              <w:rPr>
-                <w:rFonts w:ascii="Calibri Light" w:hAnsi="Calibri Light" w:cs="Calibri Light"/>
-                <w:b w:val="0"/>
-                <w:color w:val="auto"/>
-                <w:sz w:val="22"/>
-                <w:szCs w:val="22"/>
-              </w:rPr>
-            </w:r>
           </w:p>
         </w:tc>
         <w:tc>
@@ -578,31 +496,12 @@
             <w:r>
               <w:rPr>
                 <w:rFonts w:ascii="Calibri Light" w:hAnsi="Calibri Light" w:cs="Calibri Light"/>
-                <w:b w:val="0"/>
                 <w:bCs/>
                 <w:color w:val="auto"/>
                 <w:sz w:val="22"/>
                 <w:szCs w:val="22"/>
               </w:rPr>
               <w:t>Ciudad: Popayán, Colombia</w:t>
-            </w:r>
-            <w:r>
-              <w:rPr>
-                <w:rFonts w:ascii="Calibri Light" w:hAnsi="Calibri Light" w:cs="Calibri Light"/>
-                <w:bCs/>
-                <w:color w:val="auto"/>
-                <w:sz w:val="22"/>
-                <w:szCs w:val="22"/>
-              </w:rPr>
-            </w:r>
-            <w:r>
-              <w:rPr>
-                <w:rFonts w:ascii="Calibri Light" w:hAnsi="Calibri Light" w:cs="Calibri Light"/>
-                <w:bCs/>
-                <w:color w:val="auto"/>
-                <w:sz w:val="22"/>
-                <w:szCs w:val="22"/>
-              </w:rPr>
             </w:r>
           </w:p>
         </w:tc>
@@ -636,101 +535,69 @@
             </w:pPr>
             <w:r>
               <w:rPr>
-                <w:b w:val="0"/>
-              </w:rPr>
-              <w:t>Situación Expediente Académico (Finalizado o Pendiente de): Finalizado — Maestría en Administración (MBA) graduado el 19/06/2025. Acta de Grado 1040, Universidad EAFIT.</w:t>
+                <w:color w:val="auto"/>
+                <w:sz w:val="22"/>
+              </w:rPr>
+              <w:t>Situación Expediente Académico (Finalizado o Pendiente de):</w:t>
+            </w:r>
+            <w:r>
+              <w:rPr>
+                <w:b w:val="0"/>
+                <w:bCs w:val="0"/>
+                <w:color w:val="auto"/>
+                <w:sz w:val="22"/>
+              </w:rPr>
+              <w:t xml:space="preserve"> Finalizado — Maestría en Administración (MBA) graduado el 19/06/2025. Acta de Grado 1040, Universidad EAFIT.</w:t>
+            </w:r>
+            <w:r>
+              <w:rPr>
+                <w:b w:val="0"/>
+                <w:bCs w:val="0"/>
+                <w:color w:val="auto"/>
+                <w:sz w:val="22"/>
+              </w:rPr>
               <w:br/>
-              <w:t>Nota Media: 4,69 / 5,00 (escala colombiana). Equivalencia España: 8,99 / 10 — Sobresaliente.</w:t>
+            </w:r>
+            <w:r>
+              <w:rPr>
+                <w:color w:val="auto"/>
+                <w:sz w:val="22"/>
+              </w:rPr>
+              <w:t>Nota Media:</w:t>
+            </w:r>
+            <w:r>
+              <w:rPr>
+                <w:b w:val="0"/>
+                <w:bCs w:val="0"/>
+                <w:color w:val="auto"/>
+                <w:sz w:val="22"/>
+              </w:rPr>
+              <w:t xml:space="preserve"> 4,69 / 5,00 (escala colombiana). Equivalencia España: 8,99 / 10 — Sobresaliente.</w:t>
+            </w:r>
+            <w:r>
+              <w:rPr>
+                <w:b w:val="0"/>
+                <w:bCs w:val="0"/>
+                <w:color w:val="auto"/>
+                <w:sz w:val="22"/>
+              </w:rPr>
               <w:br/>
-              <w:t>Experiencia profesional: Más de 15 años en gestión de proyectos de innovación, emprendimiento, comercio internacional y agroindustria. Actualmente Gerente de COFFIS SAS.</w:t>
-            </w:r>
-          </w:p>
-          <w:p>
-            <w:pPr>
-              <w:spacing w:after="0" w:line="360" w:lineRule="auto"/>
-              <w:rPr>
-                <w:rFonts w:ascii="Calibri Light" w:hAnsi="Calibri Light" w:cs="Calibri Light"/>
-                <w:b w:val="0"/>
-                <w:color w:val="auto"/>
-                <w:sz w:val="22"/>
-                <w:szCs w:val="22"/>
-              </w:rPr>
-            </w:pPr>
-            <w:r>
-              <w:rPr>
-                <w:rFonts w:ascii="Calibri Light" w:hAnsi="Calibri Light" w:cs="Calibri Light"/>
-                <w:b w:val="0"/>
-                <w:color w:val="auto"/>
-                <w:sz w:val="22"/>
-                <w:szCs w:val="22"/>
-              </w:rPr>
-              <w:t xml:space="preserve">Situación Expediente Académico (Finalizado o Pendiente de): </w:t>
-            </w:r>
-          </w:p>
-          <w:p>
-            <w:pPr>
-              <w:spacing w:after="0" w:line="360" w:lineRule="auto"/>
-              <w:rPr>
-                <w:rFonts w:ascii="Calibri Light" w:hAnsi="Calibri Light" w:cs="Calibri Light"/>
-                <w:b w:val="0"/>
-                <w:color w:val="auto"/>
-                <w:sz w:val="22"/>
-                <w:szCs w:val="22"/>
-              </w:rPr>
-            </w:pPr>
-            <w:r>
-              <w:rPr>
-                <w:rFonts w:ascii="Calibri Light" w:hAnsi="Calibri Light" w:cs="Calibri Light"/>
-                <w:b w:val="0"/>
-                <w:color w:val="auto"/>
-                <w:sz w:val="22"/>
-                <w:szCs w:val="22"/>
-              </w:rPr>
-              <w:t>Nota Media:</w:t>
-            </w:r>
-            <w:r>
-              <w:rPr>
-                <w:rFonts w:ascii="Calibri Light" w:hAnsi="Calibri Light" w:cs="Calibri Light"/>
-                <w:b w:val="0"/>
-                <w:color w:val="auto"/>
-                <w:sz w:val="22"/>
-                <w:szCs w:val="22"/>
-              </w:rPr>
-              <w:t xml:space="preserve"> </w:t>
-            </w:r>
-          </w:p>
-          <w:p>
-            <w:pPr>
-              <w:spacing w:after="0" w:line="360" w:lineRule="auto"/>
-              <w:rPr>
-                <w:rFonts w:ascii="Calibri Light" w:hAnsi="Calibri Light" w:cs="Calibri Light"/>
-                <w:b w:val="0"/>
-                <w:color w:val="auto"/>
-                <w:sz w:val="22"/>
-                <w:szCs w:val="22"/>
-              </w:rPr>
-            </w:pPr>
-          </w:p>
-          <w:p>
-            <w:pPr>
-              <w:spacing w:after="0" w:line="360" w:lineRule="auto"/>
-              <w:rPr>
-                <w:rFonts w:ascii="Calibri Light" w:hAnsi="Calibri Light" w:cs="Calibri Light"/>
-                <w:b w:val="0"/>
-                <w:color w:val="auto"/>
-                <w:sz w:val="22"/>
-                <w:szCs w:val="22"/>
-              </w:rPr>
-            </w:pPr>
-            <w:r>
-              <w:rPr>
-                <w:rFonts w:ascii="Calibri Light" w:hAnsi="Calibri Light" w:cs="Calibri Light"/>
-                <w:b w:val="0"/>
-                <w:color w:val="auto"/>
-                <w:sz w:val="22"/>
-                <w:szCs w:val="22"/>
+            </w:r>
+            <w:r>
+              <w:rPr>
+                <w:color w:val="auto"/>
+                <w:sz w:val="22"/>
               </w:rPr>
               <w:t>Experiencia profesional:</w:t>
+            </w:r>
+            <w:r>
+              <w:rPr>
+                <w:b w:val="0"/>
+                <w:bCs w:val="0"/>
+                <w:color w:val="auto"/>
+                <w:sz w:val="22"/>
+              </w:rPr>
+              <w:t xml:space="preserve"> Más de 15 años en gestión de proyectos de innovación, emprendimiento, comercio internacional y agroindustria. Actualmente Gerente de COFFIS SAS.</w:t>
             </w:r>
           </w:p>
         </w:tc>
@@ -776,23 +643,31 @@
             </w:r>
           </w:p>
           <w:p>
-            <w:pPr>
-              <w:spacing w:after="200" w:line="276" w:lineRule="auto"/>
-              <w:rPr>
-                <w:rFonts w:ascii="Calibri Light" w:hAnsi="Calibri Light" w:cs="Calibri Light"/>
-                <w:bCs/>
-                <w:sz w:val="22"/>
-                <w:szCs w:val="22"/>
-              </w:rPr>
-            </w:pPr>
-          </w:p>
-          <w:p>
-            <w:r>
-              <w:rPr>
-                <w:b w:val="0"/>
-                <w:sz w:val="22"/>
-              </w:rPr>
-              <w:t>Sí, actualmente soy Gerente y co-fundador de COFFIS SAS (Popayán, Colombia), una plataforma tecnológica que democratiza el acceso de pequeños caficultores colombianos a mercados internacionales mediante exportación en pequeñas cantidades, eliminando intermediarios y mejorando los precios al productor. Mis funciones principales incluyen la dirección estratégica de la empresa, la articulación con 33 cooperativas y más de 300 caficultores, la gestión de la cadena de exportación desde origen hasta compradores en Estados Unidos y Canadá, y la transferencia de conocimiento a productores rurales en estándares internacionales de calidad, trazabilidad y sostenibilidad. Antes de COFFIS dirigí el proyecto CAFIX en ALMACAFÉ — Federación Nacional de Cafeteros, escalando una plataforma de logística de exportación de 2 a 56 despachos mensuales, y organicé la misión comercial en Oslo para caficultores firmantes del Acuerdo de Paz.</w:t>
+            <w:r>
+              <w:rPr>
+                <w:sz w:val="22"/>
+              </w:rPr>
+              <w:t xml:space="preserve">Sí, actualmente soy Gerente y co-fundador de COFFIS SAS (Popayán, Colombia), una plataforma tecnológica que democratiza el acceso de pequeños caficultores colombianos a mercados internacionales mediante exportación en pequeñas cantidades, eliminando intermediarios y mejorando los precios al productor. Mis funciones principales incluyen la dirección estratégica de la empresa, la articulación con 33 cooperativas y más de 300 caficultores, la gestión de la cadena de exportación desde origen hasta compradores en Estados Unidos y Canadá, y la transferencia de conocimiento a productores rurales en estándares internacionales de calidad, trazabilidad y sostenibilidad. Antes de COFFIS dirigí el proyecto CAFIX en ALMACAFÉ — Federación Nacional de Cafeteros, escalando una plataforma de logística de exportación </w:t>
+            </w:r>
+            <w:r>
+              <w:rPr>
+                <w:sz w:val="22"/>
+              </w:rPr>
+              <w:t xml:space="preserve">para </w:t>
+            </w:r>
+            <w:proofErr w:type="gramStart"/>
+            <w:r>
+              <w:rPr>
+                <w:sz w:val="22"/>
+              </w:rPr>
+              <w:t>caficultores base</w:t>
+            </w:r>
+            <w:proofErr w:type="gramEnd"/>
+            <w:r>
+              <w:rPr>
+                <w:sz w:val="22"/>
+              </w:rPr>
+              <w:t>, y organicé la misión comercial en Oslo para caficultores firmantes del Acuerdo de Paz.</w:t>
             </w:r>
           </w:p>
         </w:tc>
@@ -825,38 +700,10 @@
               </w:rPr>
               <w:t>¿Qué buscas al hacer el doctorado?</w:t>
             </w:r>
-            <w:r>
-              <w:rPr>
-                <w:rFonts w:ascii="Calibri Light" w:hAnsi="Calibri Light" w:cs="Calibri Light"/>
-                <w:bCs/>
-                <w:sz w:val="22"/>
-                <w:szCs w:val="22"/>
-              </w:rPr>
-            </w:r>
-            <w:r>
-              <w:rPr>
-                <w:rFonts w:ascii="Calibri Light" w:hAnsi="Calibri Light" w:cs="Calibri Light"/>
-                <w:bCs/>
-                <w:sz w:val="22"/>
-                <w:szCs w:val="22"/>
-              </w:rPr>
-            </w:r>
-          </w:p>
-          <w:p>
-            <w:pPr>
-              <w:spacing w:after="200" w:line="276" w:lineRule="auto"/>
-              <w:rPr>
-                <w:rFonts w:ascii="Calibri Light" w:hAnsi="Calibri Light" w:cs="Calibri Light"/>
-                <w:bCs/>
-                <w:sz w:val="22"/>
-                <w:szCs w:val="22"/>
-              </w:rPr>
-            </w:pPr>
-          </w:p>
-          <w:p>
-            <w:r>
-              <w:rPr>
-                <w:b w:val="0"/>
+          </w:p>
+          <w:p>
+            <w:r>
+              <w:rPr>
                 <w:sz w:val="22"/>
               </w:rPr>
               <w:t>Busco desarrollar conocimiento práctico que ayude a transformar la sociedad. Después de 15 años en la práctica profesional en el sector cafetero colombiano, he identificado una brecha estructural que la sola intervención práctica no logra cerrar: los pequeños caficultores capturan apenas entre el 7 % y el 10 % del valor final de su café, a pesar de la existencia de sellos de sostenibilidad, cooperativas y políticas públicas. El doctorado me permitirá investigar con rigor metodológico las condiciones de gobernanza que pueden cambiar esta realidad, producir conocimiento original sobre desarrollo inclusivo en territorios de posconflicto y diseñar artefactos implementables que las propias comunidades puedan apropiarse. Quiero ser un investigador-práctico capaz de articular la evidencia académica con la transformación territorial real.</w:t>
@@ -898,70 +745,44 @@
               </w:rPr>
               <w:t>Indica las dos principales motivaciones que te han animado a interesarte por nuestro programa de doctorado.</w:t>
             </w:r>
-            <w:r>
-              <w:rPr>
-                <w:rFonts w:ascii="Calibri Light" w:hAnsi="Calibri Light" w:cs="Calibri Light"/>
+          </w:p>
+          <w:p>
+            <w:r>
+              <w:rPr>
+                <w:b/>
                 <w:bCs/>
                 <w:sz w:val="22"/>
-                <w:szCs w:val="22"/>
-              </w:rPr>
-            </w:r>
-            <w:r>
-              <w:rPr>
-                <w:rFonts w:ascii="Calibri Light" w:hAnsi="Calibri Light" w:cs="Calibri Light"/>
+              </w:rPr>
+              <w:t>Primera motivación:</w:t>
+            </w:r>
+            <w:r>
+              <w:rPr>
+                <w:sz w:val="22"/>
+              </w:rPr>
+              <w:t xml:space="preserve"> la sostenibilidad como eje articulador del programa. Nada de lo que se haga en territorios PDET tiene sentido sin un enfoque integral de sostenibilidad ambiental, social y económica. El Programa de Desarrollo Inclusivo y Sostenible de la Universidad Loyola Andalucía coloca la sostenibilidad y la inclusión en el </w:t>
+            </w:r>
+            <w:r>
+              <w:rPr>
+                <w:sz w:val="22"/>
+              </w:rPr>
+              <w:lastRenderedPageBreak/>
+              <w:t>corazón de su agenda investigadora, lo que es coherente con mi objeto de investigación: la gobernanza digital asociativa para asociaciones caficultoras en territorios PDET del posconflicto colombiano.</w:t>
+            </w:r>
+          </w:p>
+          <w:p>
+            <w:r>
+              <w:rPr>
+                <w:b/>
                 <w:bCs/>
                 <w:sz w:val="22"/>
-                <w:szCs w:val="22"/>
-              </w:rPr>
-            </w:r>
-          </w:p>
-          <w:p>
-            <w:pPr>
-              <w:pStyle w:val="Prrafodelista"/>
-              <w:ind w:left="0"/>
-              <w:rPr>
-                <w:rFonts w:ascii="Calibri Light" w:hAnsi="Calibri Light" w:cs="Calibri Light"/>
-                <w:bCs/>
-                <w:i/>
-                <w:iCs/>
-                <w:sz w:val="22"/>
-                <w:szCs w:val="22"/>
-              </w:rPr>
-            </w:pPr>
-          </w:p>
-          <w:p>
-            <w:pPr>
-              <w:pStyle w:val="Prrafodelista"/>
-              <w:numPr>
-                <w:ilvl w:val="0"/>
-                <w:numId w:val="6"/>
-              </w:numPr>
-              <w:rPr>
-                <w:rFonts w:ascii="Calibri Light" w:hAnsi="Calibri Light" w:cs="Calibri Light"/>
-                <w:bCs/>
-                <w:i/>
-                <w:iCs/>
-                <w:sz w:val="22"/>
-                <w:szCs w:val="22"/>
-              </w:rPr>
-            </w:pPr>
-          </w:p>
-          <w:p>
-            <w:r>
-              <w:rPr>
-                <w:b w:val="0"/>
-                <w:sz w:val="22"/>
-              </w:rPr>
-              <w:t>Primera motivación: la sostenibilidad como eje articulador del programa. Nada de lo que se haga en territorios PDET tiene sentido sin un enfoque integral de sostenibilidad ambiental, social y económica. El Programa de Desarrollo Inclusivo y Sostenible de la Universidad Loyola Andalucía coloca la sostenibilidad y la inclusión en el corazón de su agenda investigadora, lo que es coherente con mi objeto de investigación: la gobernanza digital asociativa para asociaciones caficultoras en territorios PDET del posconflicto colombiano.</w:t>
-            </w:r>
-          </w:p>
-          <w:p>
-            <w:r>
-              <w:rPr>
-                <w:b w:val="0"/>
-                <w:sz w:val="22"/>
-              </w:rPr>
-              <w:t>Segunda motivación: las tres líneas de investigación del programa —Pobreza, Inclusión, Territorio y Cooperación; Gobernanza, Derechos Humanos y Fundamentales; y Capacidades Empresariales, Crecimiento Económico y Desarrollo— se articulan directamente con los componentes de mi proyecto doctoral. La tradición de la Fundación ETEA — Instituto de Desarrollo en investigación aplicada al desarrollo desde la economía social ofrece el marco institucional ideal para esta investigación.</w:t>
+              </w:rPr>
+              <w:t xml:space="preserve">Segunda motivación: </w:t>
+            </w:r>
+            <w:r>
+              <w:rPr>
+                <w:sz w:val="22"/>
+              </w:rPr>
+              <w:t>las tres líneas de investigación del programa —Pobreza, Inclusión, Territorio y Cooperación; Gobernanza, Derechos Humanos y Fundamentales; y Capacidades Empresariales, Crecimiento Económico y Desarrollo— se articulan directamente con los componentes de mi proyecto doctoral. La tradición de la Fundación ETEA — Instituto de Desarrollo en investigación aplicada al desarrollo desde la economía social ofrece el marco institucional ideal para esta investigación.</w:t>
             </w:r>
           </w:p>
         </w:tc>
@@ -992,24 +813,12 @@
                 <w:sz w:val="22"/>
                 <w:szCs w:val="22"/>
               </w:rPr>
+              <w:lastRenderedPageBreak/>
               <w:t>¿Qué esperas que el Programa te aporte en tu desarrollo profesional/investigador?</w:t>
             </w:r>
-            <w:r>
-              <w:rPr>
-                <w:rFonts w:ascii="Calibri Light" w:hAnsi="Calibri Light" w:cs="Calibri Light"/>
-                <w:bCs/>
-                <w:sz w:val="22"/>
-                <w:szCs w:val="22"/>
-              </w:rPr>
-            </w:r>
           </w:p>
           <w:p>
             <w:pPr>
-              <w:pStyle w:val="Prrafodelista"/>
-              <w:numPr>
-                <w:ilvl w:val="0"/>
-                <w:numId w:val="12"/>
-              </w:numPr>
               <w:spacing w:after="200" w:line="276" w:lineRule="auto"/>
               <w:rPr>
                 <w:rFonts w:ascii="Calibri Light" w:hAnsi="Calibri Light" w:cs="Calibri Light"/>
@@ -1020,14 +829,85 @@
                 <w:szCs w:val="22"/>
               </w:rPr>
             </w:pPr>
-          </w:p>
-          <w:p>
-            <w:r>
-              <w:rPr>
-                <w:b w:val="0"/>
-                <w:sz w:val="22"/>
-              </w:rPr>
-              <w:t>Espero que el programa me aporte tres cosas centrales para mi desarrollo. Primero, el desarrollo riguroso de mi perfil investigador: dominio del paradigma Design Science Research, métodos cuantitativos avanzados (simulación Monte Carlo, índices de sensibilidad de Sobol, análisis bajo incertidumbre profunda) y métodos cualitativos como el análisis de redes sociales y el panel Delphi. Segundo, la capacidad de generar conocimiento nuevo que ayude a la sociedad: producir constructos originales (Gobernanza Digital Asociativa, Valor Capturado en Origen, Índice de Consolidación PDET) que sean transferibles a otras cadenas agroalimentarias del Sur Global. Tercero, la red de colaboración académica y de cooperación internacional que la Universidad Loyola Andalucía y la Fundación ETEA tejen en torno al desarrollo, fundamental para sostener una agenda de investigación a largo plazo.</w:t>
+            <w:r>
+              <w:rPr>
+                <w:sz w:val="22"/>
+              </w:rPr>
+              <w:t xml:space="preserve">Espero que el programa me aporte tres cosas centrales para mi desarrollo. </w:t>
+            </w:r>
+            <w:r>
+              <w:rPr>
+                <w:b/>
+                <w:bCs/>
+                <w:sz w:val="22"/>
+              </w:rPr>
+              <w:t>Primero</w:t>
+            </w:r>
+            <w:r>
+              <w:rPr>
+                <w:sz w:val="22"/>
+              </w:rPr>
+              <w:t xml:space="preserve">, el desarrollo riguroso de mi perfil investigador: dominio del paradigma Design Science </w:t>
+            </w:r>
+            <w:proofErr w:type="spellStart"/>
+            <w:r>
+              <w:rPr>
+                <w:sz w:val="22"/>
+              </w:rPr>
+              <w:t>Research</w:t>
+            </w:r>
+            <w:proofErr w:type="spellEnd"/>
+            <w:r>
+              <w:rPr>
+                <w:sz w:val="22"/>
+              </w:rPr>
+              <w:t xml:space="preserve"> y</w:t>
+            </w:r>
+            <w:r>
+              <w:rPr>
+                <w:sz w:val="22"/>
+              </w:rPr>
+              <w:t xml:space="preserve"> métodos cuantitativos</w:t>
+            </w:r>
+            <w:r>
+              <w:rPr>
+                <w:sz w:val="22"/>
+              </w:rPr>
+              <w:t xml:space="preserve"> y cualitativos</w:t>
+            </w:r>
+            <w:r>
+              <w:rPr>
+                <w:sz w:val="22"/>
+              </w:rPr>
+              <w:t xml:space="preserve"> avanzados. </w:t>
+            </w:r>
+            <w:r>
+              <w:rPr>
+                <w:b/>
+                <w:bCs/>
+                <w:sz w:val="22"/>
+              </w:rPr>
+              <w:t>Segundo</w:t>
+            </w:r>
+            <w:r>
+              <w:rPr>
+                <w:sz w:val="22"/>
+              </w:rPr>
+              <w:t xml:space="preserve">, la capacidad de generar conocimiento nuevo que ayude a la sociedad. </w:t>
+            </w:r>
+            <w:r>
+              <w:rPr>
+                <w:b/>
+                <w:bCs/>
+                <w:sz w:val="22"/>
+              </w:rPr>
+              <w:t>Tercero</w:t>
+            </w:r>
+            <w:r>
+              <w:rPr>
+                <w:sz w:val="22"/>
+              </w:rPr>
+              <w:t>, la red de colaboración académica y de cooperación internacional que la Universidad Loyola Andalucía y la Fundación ETEA tejen en torno al desarrollo para sostener una agenda de investigación a largo plazo.</w:t>
             </w:r>
           </w:p>
         </w:tc>
@@ -1062,48 +942,51 @@
             </w:r>
           </w:p>
           <w:p>
-            <w:pPr>
-              <w:pStyle w:val="Prrafodelista"/>
-              <w:numPr>
-                <w:ilvl w:val="0"/>
-                <w:numId w:val="13"/>
-              </w:numPr>
-              <w:spacing w:after="200" w:line="276" w:lineRule="auto"/>
-              <w:rPr>
-                <w:rFonts w:ascii="Calibri Light" w:hAnsi="Calibri Light" w:cs="Calibri Light"/>
+            <w:r>
+              <w:rPr>
+                <w:b/>
                 <w:bCs/>
-                <w:i/>
-                <w:iCs/>
-                <w:sz w:val="22"/>
-                <w:szCs w:val="22"/>
-              </w:rPr>
-            </w:pPr>
-          </w:p>
-          <w:p>
-            <w:r>
-              <w:rPr>
-                <w:b w:val="0"/>
-                <w:sz w:val="22"/>
-              </w:rPr>
-              <w:t>Primera: creatividad. He demostrado capacidad de diseñar e implementar soluciones innovadoras donde no existían (la plataforma CAFIX para la FNC, COFFIS para pequeños productores), articulando tecnología, gobernanza y mercado.</w:t>
-            </w:r>
-          </w:p>
-          <w:p>
-            <w:r>
-              <w:rPr>
-                <w:b w:val="0"/>
-                <w:sz w:val="22"/>
-              </w:rPr>
-              <w:t>Segunda: orientación al logro. He llevado a término proyectos complejos con resultados verificables (escalamiento 28x de CAFIX, primera exportación de ron colombiano a Chile, transformación digital de EMTEL con +175 % en ingresos), lo que me permite afrontar el doctorado como un proyecto de cuatro años con hitos claros y entregables concretos.</w:t>
-            </w:r>
-          </w:p>
-          <w:p>
-            <w:r>
-              <w:rPr>
-                <w:b w:val="0"/>
-                <w:sz w:val="22"/>
-              </w:rPr>
-              <w:t>Tercera: empatía. Mi capacidad de comprensión de las realidades de las comunidades caficultoras rurales, los firmantes de paz en proceso de reincorporación y los pequeños productores del Cauca, sumada a relaciones institucionales con la FNC, gobernaciones y cooperativas, me da acceso al campo empírico y legitimidad comunitaria para la investigación.</w:t>
+                <w:sz w:val="22"/>
+              </w:rPr>
+              <w:t>Primera:</w:t>
+            </w:r>
+            <w:r>
+              <w:rPr>
+                <w:sz w:val="22"/>
+              </w:rPr>
+              <w:t xml:space="preserve"> creatividad. He demostrado capacidad de diseñar e implementar soluciones innovadoras donde no existían (la plataforma CAFIX para la FNC, COFFIS para pequeños productores), articulando tecnología, gobernanza y mercado.</w:t>
+            </w:r>
+          </w:p>
+          <w:p>
+            <w:r>
+              <w:rPr>
+                <w:b/>
+                <w:bCs/>
+                <w:sz w:val="22"/>
+              </w:rPr>
+              <w:t>Segunda:</w:t>
+            </w:r>
+            <w:r>
+              <w:rPr>
+                <w:sz w:val="22"/>
+              </w:rPr>
+              <w:t xml:space="preserve"> orientación al logro. He llevado a término proyectos complejos con resultados verificables lo que me permite afrontar el doctorado como un proyecto de cuatro años con hitos claros y entregables concretos.</w:t>
+            </w:r>
+          </w:p>
+          <w:p>
+            <w:r>
+              <w:rPr>
+                <w:b/>
+                <w:bCs/>
+                <w:sz w:val="22"/>
+              </w:rPr>
+              <w:t>Tercera:</w:t>
+            </w:r>
+            <w:r>
+              <w:rPr>
+                <w:sz w:val="22"/>
+              </w:rPr>
+              <w:t xml:space="preserve"> empatía. Mi capacidad de comprensión de las realidades de las comunidades caficultoras rurales, los firmantes de paz en proceso de reincorporación y los pequeños productores del Cauca, sumada a relaciones institucionales con la FNC, gobernaciones y cooperativas, me da acceso al campo empírico y legitimidad comunitaria para la investigación.</w:t>
             </w:r>
           </w:p>
         </w:tc>
@@ -1136,61 +1019,10 @@
               </w:rPr>
               <w:t>Indica tres aspectos en los que deberías mejorar.</w:t>
             </w:r>
-            <w:r>
-              <w:rPr>
-                <w:rFonts w:ascii="Calibri Light" w:hAnsi="Calibri Light" w:cs="Calibri Light"/>
-                <w:bCs/>
-                <w:sz w:val="22"/>
-                <w:szCs w:val="22"/>
-              </w:rPr>
-            </w:r>
-            <w:r>
-              <w:rPr>
-                <w:rFonts w:ascii="Calibri Light" w:hAnsi="Calibri Light" w:cs="Calibri Light"/>
-                <w:bCs/>
-                <w:sz w:val="22"/>
-                <w:szCs w:val="22"/>
-              </w:rPr>
-            </w:r>
-            <w:r>
-              <w:rPr>
-                <w:rFonts w:ascii="Calibri Light" w:hAnsi="Calibri Light" w:cs="Calibri Light"/>
-                <w:bCs/>
-                <w:sz w:val="22"/>
-                <w:szCs w:val="22"/>
-              </w:rPr>
-            </w:r>
-            <w:r>
-              <w:rPr>
-                <w:rFonts w:ascii="Calibri Light" w:hAnsi="Calibri Light" w:cs="Calibri Light"/>
-                <w:bCs/>
-                <w:sz w:val="22"/>
-                <w:szCs w:val="22"/>
-              </w:rPr>
-            </w:r>
-          </w:p>
-          <w:p>
-            <w:pPr>
-              <w:pStyle w:val="Prrafodelista"/>
-              <w:numPr>
-                <w:ilvl w:val="0"/>
-                <w:numId w:val="14"/>
-              </w:numPr>
-              <w:spacing w:after="200" w:line="276" w:lineRule="auto"/>
-              <w:rPr>
-                <w:rFonts w:ascii="Calibri Light" w:hAnsi="Calibri Light" w:cs="Calibri Light"/>
-                <w:bCs/>
-                <w:i/>
-                <w:iCs/>
-                <w:sz w:val="22"/>
-                <w:szCs w:val="22"/>
-              </w:rPr>
-            </w:pPr>
-          </w:p>
-          <w:p>
-            <w:r>
-              <w:rPr>
-                <w:b w:val="0"/>
+          </w:p>
+          <w:p>
+            <w:r>
+              <w:rPr>
                 <w:sz w:val="22"/>
               </w:rPr>
               <w:t>Primera: comunicación asertiva. Debo perfeccionar mi capacidad de comunicar ideas complejas de forma clara y directa en contextos académicos exigentes, especialmente en defensa de tesis, congresos internacionales y publicaciones en revistas indexadas.</w:t>
@@ -1199,7 +1031,6 @@
           <w:p>
             <w:r>
               <w:rPr>
-                <w:b w:val="0"/>
                 <w:sz w:val="22"/>
               </w:rPr>
               <w:t>Segunda: lectura más acertada de los contextos para la toma de decisiones. En la práctica profesional he tomado decisiones de alto impacto, pero el doctorado exige un grado mayor de análisis contextual riguroso antes de actuar, especialmente en escenarios de incertidumbre profunda como los territorios PDET.</w:t>
@@ -1208,7 +1039,6 @@
           <w:p>
             <w:r>
               <w:rPr>
-                <w:b w:val="0"/>
                 <w:sz w:val="22"/>
               </w:rPr>
               <w:t>Tercera: vigilancia de sesgos personales. Mi experiencia práctica con el sector cafetero puede generar sesgos de confirmación en el análisis empírico. Necesito fortalecer las prácticas de reflexividad investigativa, validación cruzada de datos y triangulación metodológica para asegurar la rigurosidad científica de mis conclusiones.</w:t>
@@ -1244,41 +1074,32 @@
               </w:rPr>
               <w:t>Cuéntame la experiencia previa con la que cuentas en investigación (participación en proyectos, etc.).</w:t>
             </w:r>
-            <w:r>
-              <w:rPr>
-                <w:rFonts w:ascii="Calibri Light" w:hAnsi="Calibri Light" w:cs="Calibri Light"/>
-                <w:bCs/>
-                <w:sz w:val="22"/>
-                <w:szCs w:val="22"/>
-              </w:rPr>
-            </w:r>
-          </w:p>
-          <w:p>
-            <w:pPr>
-              <w:pStyle w:val="Prrafodelista"/>
-              <w:numPr>
-                <w:ilvl w:val="0"/>
-                <w:numId w:val="15"/>
-              </w:numPr>
-              <w:spacing w:after="200" w:line="276" w:lineRule="auto"/>
-              <w:jc w:val="both"/>
-              <w:rPr>
-                <w:rFonts w:ascii="Calibri Light" w:hAnsi="Calibri Light" w:cs="Calibri Light"/>
-                <w:bCs/>
-                <w:i/>
-                <w:iCs/>
-                <w:sz w:val="22"/>
-                <w:szCs w:val="22"/>
-              </w:rPr>
-            </w:pPr>
-          </w:p>
-          <w:p>
-            <w:r>
-              <w:rPr>
-                <w:b w:val="0"/>
-                <w:sz w:val="22"/>
-              </w:rPr>
-              <w:t>Cuento con experiencia investigativa desarrollada en mis tres ciclos de formación universitaria. En el pregrado de Ingeniería en Electrónica y Telecomunicaciones (Universidad del Cauca) desarrollé como trabajo de grado la investigación "Coexistencia de redes WiMAX fijas y WiMAX móviles", abordando estrategias de convergencia de tecnologías inalámbricas de banda ancha. En la Especialización en Gerencia de Proyectos (Universidad del Cauca) trabajé en la aplicación rigurosa de metodologías PMI a la gestión de proyectos complejos. En la Maestría en Administración (MBA, Universidad EAFIT) desarrollé el trabajo de investigación "Pre-feasibility study of an e-commerce technology platform for the marketing of green specialty coffee in the United States market by the Federación Nacional de Cafeteros de Colombia", un estudio de prefactibilidad que integra análisis de mercado, tecnológico, organizacional y financiero, con un enfoque metodológico mixto que combina revisión sistemática de literatura, análisis de datos cuantitativos y modelado financiero a cinco años. Adicionalmente, durante mi trayectoria profesional he gestionado proyectos de innovación en CTeI en la Gobernación del Huila (5 proyectos estratégicos en Ciencia, Tecnología e Innovación), articulando agendas de investigación entre la academia, el sector público y las comunidades.</w:t>
+          </w:p>
+          <w:p>
+            <w:r>
+              <w:rPr>
+                <w:sz w:val="22"/>
+              </w:rPr>
+              <w:t>Cuento con experiencia investigativa desarrollada en mis tres ciclos de formación universitaria. En el pregrado de Ingeniería en Electrónica y Telecomunicaciones (Universidad del Cauca) desarrollé como trabajo de grado la investigación "Coexistencia de redes WiMAX fijas y WiMAX móviles", abordando estrategias de convergencia de tecnologías inalámbricas de banda ancha. En la Especialización en Gerencia de Proyectos (Universidad del Cauca) trabajé en la aplicación rigurosa de metodologías PMI a la gestión de proyectos complejos</w:t>
+            </w:r>
+            <w:r>
+              <w:rPr>
+                <w:sz w:val="22"/>
+              </w:rPr>
+              <w:t xml:space="preserve"> para una marca de Café familiar</w:t>
+            </w:r>
+            <w:r>
+              <w:rPr>
+                <w:sz w:val="22"/>
+              </w:rPr>
+              <w:t xml:space="preserve">. En la Maestría en Administración (MBA, Universidad EAFIT) desarrollé el trabajo de investigación "Pre-feasibility study of an e-commerce technology platform for the marketing of green specialty coffee in the United States market by the Federación Nacional de Cafeteros de Colombia", un estudio de </w:t>
+            </w:r>
+            <w:r>
+              <w:rPr>
+                <w:sz w:val="22"/>
+              </w:rPr>
+              <w:lastRenderedPageBreak/>
+              <w:t>prefactibilidad que integra análisis de mercado, tecnológico, organizacional y financiero, con un enfoque metodológico mixto que combina revisión sistemática de literatura, análisis de datos cuantitativos y modelado financiero a cinco años. Adicionalmente, durante mi trayectoria profesional he gestionado proyectos de innovación en CTeI en la Gobernación del Huila (5 proyectos estratégicos en Ciencia, Tecnología e Innovación), articulando agendas de investigación entre la academia, el sector público y las comunidades.</w:t>
             </w:r>
           </w:p>
         </w:tc>
@@ -1309,40 +1130,13 @@
                 <w:sz w:val="22"/>
                 <w:szCs w:val="22"/>
               </w:rPr>
+              <w:lastRenderedPageBreak/>
               <w:t>¿Cómo has conocido la existencia del programa de doctorado? ¿Tienes contactos en la Universidad Loyola Andalucía?</w:t>
             </w:r>
-            <w:r>
-              <w:rPr>
-                <w:rFonts w:ascii="Calibri Light" w:hAnsi="Calibri Light" w:cs="Calibri Light"/>
-                <w:bCs/>
-                <w:sz w:val="22"/>
-                <w:szCs w:val="22"/>
-              </w:rPr>
-            </w:r>
-            <w:r>
-              <w:rPr>
-                <w:rFonts w:ascii="Calibri Light" w:hAnsi="Calibri Light" w:cs="Calibri Light"/>
-                <w:bCs/>
-                <w:sz w:val="22"/>
-                <w:szCs w:val="22"/>
-              </w:rPr>
-            </w:r>
-          </w:p>
-          <w:p>
-            <w:pPr>
-              <w:spacing w:after="200" w:line="276" w:lineRule="auto"/>
-              <w:rPr>
-                <w:rFonts w:ascii="Calibri Light" w:hAnsi="Calibri Light" w:cs="Calibri Light"/>
-                <w:bCs/>
-                <w:sz w:val="22"/>
-                <w:szCs w:val="22"/>
-              </w:rPr>
-            </w:pPr>
-          </w:p>
-          <w:p>
-            <w:r>
-              <w:rPr>
-                <w:b w:val="0"/>
+          </w:p>
+          <w:p>
+            <w:r>
+              <w:rPr>
                 <w:sz w:val="22"/>
               </w:rPr>
               <w:t>Conocí el programa a través de una búsqueda sistemática en internet de programas doctorales en Europa con enfoque explícito en sostenibilidad, desarrollo inclusivo y economía social. El Programa de Doctorado en Desarrollo Inclusivo y Sostenible de la Universidad Loyola Andalucía apareció como uno de los más alineados con mi objeto de investigación. La trayectoria de la Fundación ETEA — Instituto de Desarrollo en investigación sobre desarrollo, su tradición jesuita de compromiso social y su articulación con redes de cooperación internacional reforzaron mi interés. En este momento no tengo contactos directos en la Universidad Loyola Andalucía, lo cual veo como una oportunidad de iniciar una relación académica con la institución desde la admisión al programa.</w:t>
@@ -1378,44 +1172,53 @@
               </w:rPr>
               <w:t>Otra información relevante (becas de investigación, estancias, etc.).</w:t>
             </w:r>
-            <w:r>
-              <w:rPr>
-                <w:rFonts w:ascii="Calibri Light" w:hAnsi="Calibri Light" w:cs="Calibri Light"/>
-                <w:bCs/>
-                <w:sz w:val="22"/>
-                <w:szCs w:val="22"/>
-              </w:rPr>
-            </w:r>
-            <w:r>
-              <w:rPr>
-                <w:rFonts w:ascii="Calibri Light" w:hAnsi="Calibri Light" w:cs="Calibri Light"/>
-                <w:bCs/>
-                <w:sz w:val="22"/>
-                <w:szCs w:val="22"/>
-              </w:rPr>
-            </w:r>
-          </w:p>
-          <w:p>
-            <w:pPr>
-              <w:spacing w:after="200" w:line="276" w:lineRule="auto"/>
-              <w:jc w:val="both"/>
-              <w:rPr>
-                <w:rFonts w:ascii="Calibri Light" w:hAnsi="Calibri Light" w:cs="Calibri Light"/>
-                <w:bCs/>
-                <w:i/>
-                <w:iCs/>
-                <w:sz w:val="22"/>
-                <w:szCs w:val="22"/>
-              </w:rPr>
-            </w:pPr>
-          </w:p>
-          <w:p>
-            <w:r>
-              <w:rPr>
-                <w:b w:val="0"/>
-                <w:sz w:val="22"/>
-              </w:rPr>
-              <w:t>Información complementaria relevante: (a) Reconocimientos: Premio Andrés Bello del ICFES (1999) por puntaje destacado en Examen de Estado; condonación del crédito del Fondo Emprender — SENA (2025) por cumplimiento sobresaliente de metas de sostenibilidad y empleo con Cerro Brujo Café. (b) Estancias internacionales recientes: facilitador en la misión comercial de Oslo (Noruega, 2022) para caficultores del Acuerdo de Paz, y en el Foro Mundial de la Paz en París (Francia, 2024). Estancia académica en Kedge Business School — París (junio–julio 2025). (c) Idiomas: español nativo, inglés C1 con certificación EF SET, italiano B1. (d) Acceso al campo empírico: dispongo de acceso directo a la red FEMNCAFE (Federación Mesa Nacional del Café), que agremia asociaciones de caficultores firmantes del Acuerdo de Paz en 9 departamentos de Colombia, lo cual garantiza la viabilidad del trabajo de campo de la tesis. (e) Disponibilidad para becas y estancias: tengo interés en explorar oportunidades de financiación vía AECID, Fundación Carolina, o convocatorias de cooperación académica que la Fundación ETEA pueda articular.</w:t>
+          </w:p>
+          <w:p>
+            <w:r>
+              <w:rPr>
+                <w:sz w:val="22"/>
+              </w:rPr>
+              <w:t xml:space="preserve">Información complementaria relevante: (a) Reconocimientos: Premio Andrés Bello del ICFES (1999) por puntaje destacado en Examen de Estado; condonación del crédito del Fondo Emprender — SENA (2025) por cumplimiento sobresaliente de metas de sostenibilidad y empleo con Cerro Brujo Café. (b) Estancias internacionales recientes: facilitador en la misión comercial de Oslo (Noruega, 2022) para caficultores del Acuerdo de Paz, y en el Foro Mundial de la Paz en París (Francia, 2024). </w:t>
+            </w:r>
+            <w:r>
+              <w:rPr>
+                <w:sz w:val="22"/>
+              </w:rPr>
+              <w:t>Atención a cursos en</w:t>
+            </w:r>
+            <w:r>
+              <w:rPr>
+                <w:sz w:val="22"/>
+              </w:rPr>
+              <w:t xml:space="preserve"> </w:t>
+            </w:r>
+            <w:proofErr w:type="spellStart"/>
+            <w:r>
+              <w:rPr>
+                <w:sz w:val="22"/>
+              </w:rPr>
+              <w:t>en</w:t>
+            </w:r>
+            <w:proofErr w:type="spellEnd"/>
+            <w:r>
+              <w:rPr>
+                <w:sz w:val="22"/>
+              </w:rPr>
+              <w:t xml:space="preserve"> </w:t>
+            </w:r>
+            <w:proofErr w:type="spellStart"/>
+            <w:r>
+              <w:rPr>
+                <w:sz w:val="22"/>
+              </w:rPr>
+              <w:t>Kedge</w:t>
+            </w:r>
+            <w:proofErr w:type="spellEnd"/>
+            <w:r>
+              <w:rPr>
+                <w:sz w:val="22"/>
+              </w:rPr>
+              <w:t xml:space="preserve"> Business School — París (junio–julio 2025). (c) Idiomas: español nativo, inglés C1 con certificación EF SET, italiano B1. (d) Acceso al campo empírico: dispongo de acceso directo a la red FEMNCAFE (Federación Mesa Nacional del Café), que agremia asociaciones de caficultores firmantes del Acuerdo de Paz en 9 departamentos de Colombia, lo cual garantiza la viabilidad del trabajo de campo de la tesis. (e) Disponibilidad para becas y estancias: tengo interés en explorar oportunidades de financiación vía AECID, Fundación Carolina, o convocatorias de cooperación académica que la Fundación ETEA pueda articular.</w:t>
             </w:r>
           </w:p>
         </w:tc>
@@ -1581,7 +1384,37 @@
                 <w:sz w:val="22"/>
                 <w:szCs w:val="22"/>
               </w:rPr>
-              <w:t xml:space="preserve">a: </w:t>
+              <w:t>o</w:t>
+            </w:r>
+            <w:r>
+              <w:rPr>
+                <w:rFonts w:ascii="Calibri Light" w:hAnsi="Calibri Light" w:cs="Calibri Light"/>
+                <w:b w:val="0"/>
+                <w:color w:val="auto"/>
+                <w:sz w:val="22"/>
+                <w:szCs w:val="22"/>
+              </w:rPr>
+              <w:t>:</w:t>
+            </w:r>
+            <w:r>
+              <w:rPr>
+                <w:rFonts w:ascii="Calibri Light" w:hAnsi="Calibri Light" w:cs="Calibri Light"/>
+                <w:b w:val="0"/>
+                <w:color w:val="auto"/>
+                <w:sz w:val="22"/>
+                <w:szCs w:val="22"/>
+              </w:rPr>
+              <w:t xml:space="preserve"> DANIEL ALEJANDRO PAJOY BASTOS</w:t>
+            </w:r>
+            <w:r>
+              <w:rPr>
+                <w:rFonts w:ascii="Calibri Light" w:hAnsi="Calibri Light" w:cs="Calibri Light"/>
+                <w:b w:val="0"/>
+                <w:color w:val="auto"/>
+                <w:sz w:val="22"/>
+                <w:szCs w:val="22"/>
+              </w:rPr>
+              <w:t xml:space="preserve"> </w:t>
             </w:r>
           </w:p>
         </w:tc>
@@ -2386,7 +2219,6 @@
         <w:docPartUnique/>
       </w:docPartObj>
     </w:sdtPr>
-    <w:sdtEndPr/>
     <w:sdtContent>
       <w:p>
         <w:pPr>
@@ -5072,7 +4904,7 @@
       <w:szCs w:val="24"/>
     </w:rPr>
   </w:style>
-  <w:style w:type="character" w:styleId="Textoennegrita">
+  <w:style w:type="character" w:styleId="Fuerte">
     <w:name w:val="Strong"/>
     <w:uiPriority w:val="22"/>
     <w:qFormat/>

</xml_diff>